<commit_message>
ajout de modifs sur src/piezo_app/app_pages/analyse.py src/piezo_app/app_pages/carto.py src/piezo_app/components/tab_carte.py templates/modele_rapport.docx
</commit_message>
<xml_diff>
--- a/templates/modele_rapport.docx
+++ b/templates/modele_rapport.docx
@@ -279,11 +279,21 @@
     </w:pPr>
     <w:r>
       <w:rPr>
+        <w:color w:val="AAAAAA"/>
+        <w:sz w:val="18"/>
+      </w:rPr>
+      <w:t>[LOGO]</w:t>
+    </w:r>
+    <w:r>
+      <w:t xml:space="preserve">  </w:t>
+    </w:r>
+    <w:r>
+      <w:rPr>
         <w:b/>
         <w:color w:val="1A3C6E"/>
         <w:sz w:val="22"/>
       </w:rPr>
-      <w:t>[LOGO / NOM DE LA SOCIÉTÉ]</w:t>
+      <w:t>[NOM DE LA SOCIÉTÉ]</w:t>
     </w:r>
     <w:r>
       <w:rPr>

</xml_diff>